<commit_message>
Update IQR and median for figure legend
</commit_message>
<xml_diff>
--- a/output/tables/icb_meds_summary_table.docx
+++ b/output/tables/icb_meds_summary_table.docx
@@ -45,8 +45,6 @@
         <w:gridCol w:w="1080"/>
         <w:gridCol w:w="1080"/>
         <w:gridCol w:w="1080"/>
-        <w:gridCol w:w="1080"/>
-        <w:gridCol w:w="1080"/>
       </w:tblGrid>
       <w:tr>
         <w:trPr>
@@ -183,38 +181,38 @@
           <w:p>
             <w:pPr>
               <w:pStyle w:val="Normal"/>
-              <w:jc w:val="right"/>
-              <w:pBdr>
-                <w:bottom w:val="none" w:sz="0" w:space="0" w:color="000000"/>
-                <w:top w:val="none" w:sz="0" w:space="0" w:color="000000"/>
-                <w:left w:val="none" w:sz="0" w:space="0" w:color="000000"/>
-                <w:right w:val="none" w:sz="0" w:space="0" w:color="000000"/>
-              </w:pBdr>
-              <w:spacing w:after="100" w:before="100" w:line="240"/>
-              <w:ind w:left="100" w:right="100" w:firstLine="0" w:firstLineChars="0"/>
-              <w:rPr>
-                <w:rFonts w:ascii="Arial" w:hAnsi="Arial" w:eastAsia="Arial" w:cs="Arial"/>
-                <w:i w:val="false"/>
-                <w:b w:val="false"/>
-                <w:u w:val="none"/>
-                <w:strike w:val="false"/>
-                <w:sz w:val="22"/>
-                <w:szCs w:val="22"/>
-                <w:color w:val="000000"/>
-              </w:rPr>
-            </w:pPr>
-            <w:r>
-              <w:rPr>
-                <w:rFonts w:ascii="Arial" w:hAnsi="Arial" w:eastAsia="Arial" w:cs="Arial"/>
-                <w:i w:val="false"/>
-                <w:b w:val="false"/>
-                <w:u w:val="none"/>
-                <w:strike w:val="false"/>
-                <w:sz w:val="22"/>
-                <w:szCs w:val="22"/>
-                <w:color w:val="000000"/>
-              </w:rPr>
-              <w:t xml:space="preserve">all_icbs_total</w:t>
+              <w:jc w:val="left"/>
+              <w:pBdr>
+                <w:bottom w:val="none" w:sz="0" w:space="0" w:color="000000"/>
+                <w:top w:val="none" w:sz="0" w:space="0" w:color="000000"/>
+                <w:left w:val="none" w:sz="0" w:space="0" w:color="000000"/>
+                <w:right w:val="none" w:sz="0" w:space="0" w:color="000000"/>
+              </w:pBdr>
+              <w:spacing w:after="100" w:before="100" w:line="240"/>
+              <w:ind w:left="100" w:right="100" w:firstLine="0" w:firstLineChars="0"/>
+              <w:rPr>
+                <w:rFonts w:ascii="Arial" w:hAnsi="Arial" w:eastAsia="Arial" w:cs="Arial"/>
+                <w:i w:val="false"/>
+                <w:b w:val="false"/>
+                <w:u w:val="none"/>
+                <w:strike w:val="false"/>
+                <w:sz w:val="22"/>
+                <w:szCs w:val="22"/>
+                <w:color w:val="000000"/>
+              </w:rPr>
+            </w:pPr>
+            <w:r>
+              <w:rPr>
+                <w:rFonts w:ascii="Arial" w:hAnsi="Arial" w:eastAsia="Arial" w:cs="Arial"/>
+                <w:i w:val="false"/>
+                <w:b w:val="false"/>
+                <w:u w:val="none"/>
+                <w:strike w:val="false"/>
+                <w:sz w:val="22"/>
+                <w:szCs w:val="22"/>
+                <w:color w:val="000000"/>
+              </w:rPr>
+              <w:t xml:space="preserve">top_icb</w:t>
             </w:r>
           </w:p>
         </w:tc>
@@ -269,7 +267,7 @@
                 <w:szCs w:val="22"/>
                 <w:color w:val="000000"/>
               </w:rPr>
-              <w:t xml:space="preserve">top_icb</w:t>
+              <w:t xml:space="preserve">bottom_icb</w:t>
             </w:r>
           </w:p>
         </w:tc>
@@ -324,7 +322,7 @@
                 <w:szCs w:val="22"/>
                 <w:color w:val="000000"/>
               </w:rPr>
-              <w:t xml:space="preserve">bottom_icb</w:t>
+              <w:t xml:space="preserve">top_5</w:t>
             </w:r>
           </w:p>
         </w:tc>
@@ -379,117 +377,7 @@
                 <w:szCs w:val="22"/>
                 <w:color w:val="000000"/>
               </w:rPr>
-              <w:t xml:space="preserve">top_5</w:t>
-            </w:r>
-          </w:p>
-        </w:tc>
-        <w:tc>
-          <w:tcPr>
-            <w:tcBorders>
-              <w:bottom w:val="single" w:sz="12" w:space="0" w:color="666666"/>
-              <w:top w:val="single" w:sz="12" w:space="0" w:color="666666"/>
-              <w:left w:val="none" w:sz="0" w:space="0" w:color="000000"/>
-              <w:right w:val="none" w:sz="0" w:space="0" w:color="000000"/>
-            </w:tcBorders>
-            <w:shd w:val="clear" w:color="auto" w:fill="FFFFFF"/>
-            <w:tcMar>
-              <w:top w:w="0" w:type="dxa"/>
-              <w:bottom w:w="0" w:type="dxa"/>
-              <w:left w:w="0" w:type="dxa"/>
-              <w:right w:w="0" w:type="dxa"/>
-            </w:tcMar>
-            <w:vAlign w:val="center"/>
-          </w:tcPr>
-          <w:p>
-            <w:pPr>
-              <w:pStyle w:val="Normal"/>
-              <w:jc w:val="left"/>
-              <w:pBdr>
-                <w:bottom w:val="none" w:sz="0" w:space="0" w:color="000000"/>
-                <w:top w:val="none" w:sz="0" w:space="0" w:color="000000"/>
-                <w:left w:val="none" w:sz="0" w:space="0" w:color="000000"/>
-                <w:right w:val="none" w:sz="0" w:space="0" w:color="000000"/>
-              </w:pBdr>
-              <w:spacing w:after="100" w:before="100" w:line="240"/>
-              <w:ind w:left="100" w:right="100" w:firstLine="0" w:firstLineChars="0"/>
-              <w:rPr>
-                <w:rFonts w:ascii="Arial" w:hAnsi="Arial" w:eastAsia="Arial" w:cs="Arial"/>
-                <w:i w:val="false"/>
-                <w:b w:val="false"/>
-                <w:u w:val="none"/>
-                <w:strike w:val="false"/>
-                <w:sz w:val="22"/>
-                <w:szCs w:val="22"/>
-                <w:color w:val="000000"/>
-              </w:rPr>
-            </w:pPr>
-            <w:r>
-              <w:rPr>
-                <w:rFonts w:ascii="Arial" w:hAnsi="Arial" w:eastAsia="Arial" w:cs="Arial"/>
-                <w:i w:val="false"/>
-                <w:b w:val="false"/>
-                <w:u w:val="none"/>
-                <w:strike w:val="false"/>
-                <w:sz w:val="22"/>
-                <w:szCs w:val="22"/>
-                <w:color w:val="000000"/>
-              </w:rPr>
               <w:t xml:space="preserve">bottom_5</w:t>
-            </w:r>
-          </w:p>
-        </w:tc>
-        <w:tc>
-          <w:tcPr>
-            <w:tcBorders>
-              <w:bottom w:val="single" w:sz="12" w:space="0" w:color="666666"/>
-              <w:top w:val="single" w:sz="12" w:space="0" w:color="666666"/>
-              <w:left w:val="none" w:sz="0" w:space="0" w:color="000000"/>
-              <w:right w:val="none" w:sz="0" w:space="0" w:color="000000"/>
-            </w:tcBorders>
-            <w:shd w:val="clear" w:color="auto" w:fill="FFFFFF"/>
-            <w:tcMar>
-              <w:top w:w="0" w:type="dxa"/>
-              <w:bottom w:w="0" w:type="dxa"/>
-              <w:left w:w="0" w:type="dxa"/>
-              <w:right w:w="0" w:type="dxa"/>
-            </w:tcMar>
-            <w:vAlign w:val="center"/>
-          </w:tcPr>
-          <w:p>
-            <w:pPr>
-              <w:pStyle w:val="Normal"/>
-              <w:jc w:val="right"/>
-              <w:pBdr>
-                <w:bottom w:val="none" w:sz="0" w:space="0" w:color="000000"/>
-                <w:top w:val="none" w:sz="0" w:space="0" w:color="000000"/>
-                <w:left w:val="none" w:sz="0" w:space="0" w:color="000000"/>
-                <w:right w:val="none" w:sz="0" w:space="0" w:color="000000"/>
-              </w:pBdr>
-              <w:spacing w:after="100" w:before="100" w:line="240"/>
-              <w:ind w:left="100" w:right="100" w:firstLine="0" w:firstLineChars="0"/>
-              <w:rPr>
-                <w:rFonts w:ascii="Arial" w:hAnsi="Arial" w:eastAsia="Arial" w:cs="Arial"/>
-                <w:i w:val="false"/>
-                <w:b w:val="false"/>
-                <w:u w:val="none"/>
-                <w:strike w:val="false"/>
-                <w:sz w:val="22"/>
-                <w:szCs w:val="22"/>
-                <w:color w:val="000000"/>
-              </w:rPr>
-            </w:pPr>
-            <w:r>
-              <w:rPr>
-                <w:rFonts w:ascii="Arial" w:hAnsi="Arial" w:eastAsia="Arial" w:cs="Arial"/>
-                <w:i w:val="false"/>
-                <w:b w:val="false"/>
-                <w:u w:val="none"/>
-                <w:strike w:val="false"/>
-                <w:sz w:val="22"/>
-                <w:szCs w:val="22"/>
-                <w:color w:val="000000"/>
-              </w:rPr>
-              <w:t xml:space="preserve">unidentified_rank</w:t>
             </w:r>
           </w:p>
         </w:tc>
@@ -848,38 +736,38 @@
           <w:p>
             <w:pPr>
               <w:pStyle w:val="Normal"/>
-              <w:jc w:val="right"/>
-              <w:pBdr>
-                <w:bottom w:val="none" w:sz="0" w:space="0" w:color="000000"/>
-                <w:top w:val="none" w:sz="0" w:space="0" w:color="000000"/>
-                <w:left w:val="none" w:sz="0" w:space="0" w:color="000000"/>
-                <w:right w:val="none" w:sz="0" w:space="0" w:color="000000"/>
-              </w:pBdr>
-              <w:spacing w:after="100" w:before="100" w:line="240"/>
-              <w:ind w:left="100" w:right="100" w:firstLine="0" w:firstLineChars="0"/>
-              <w:rPr>
-                <w:rFonts w:ascii="Arial" w:hAnsi="Arial" w:eastAsia="Arial" w:cs="Arial"/>
-                <w:i w:val="false"/>
-                <w:b w:val="false"/>
-                <w:u w:val="none"/>
-                <w:strike w:val="false"/>
-                <w:sz w:val="22"/>
-                <w:szCs w:val="22"/>
-                <w:color w:val="000000"/>
-              </w:rPr>
-            </w:pPr>
-            <w:r>
-              <w:rPr>
-                <w:rFonts w:ascii="Arial" w:hAnsi="Arial" w:eastAsia="Arial" w:cs="Arial"/>
-                <w:i w:val="false"/>
-                <w:b w:val="false"/>
-                <w:u w:val="none"/>
-                <w:strike w:val="false"/>
-                <w:sz w:val="22"/>
-                <w:szCs w:val="22"/>
-                <w:color w:val="000000"/>
-              </w:rPr>
-              <w:t xml:space="preserve">16,493,250</w:t>
+              <w:jc w:val="left"/>
+              <w:pBdr>
+                <w:bottom w:val="none" w:sz="0" w:space="0" w:color="000000"/>
+                <w:top w:val="none" w:sz="0" w:space="0" w:color="000000"/>
+                <w:left w:val="none" w:sz="0" w:space="0" w:color="000000"/>
+                <w:right w:val="none" w:sz="0" w:space="0" w:color="000000"/>
+              </w:pBdr>
+              <w:spacing w:after="100" w:before="100" w:line="240"/>
+              <w:ind w:left="100" w:right="100" w:firstLine="0" w:firstLineChars="0"/>
+              <w:rPr>
+                <w:rFonts w:ascii="Arial" w:hAnsi="Arial" w:eastAsia="Arial" w:cs="Arial"/>
+                <w:i w:val="false"/>
+                <w:b w:val="false"/>
+                <w:u w:val="none"/>
+                <w:strike w:val="false"/>
+                <w:sz w:val="22"/>
+                <w:szCs w:val="22"/>
+                <w:color w:val="000000"/>
+              </w:rPr>
+            </w:pPr>
+            <w:r>
+              <w:rPr>
+                <w:rFonts w:ascii="Arial" w:hAnsi="Arial" w:eastAsia="Arial" w:cs="Arial"/>
+                <w:i w:val="false"/>
+                <w:b w:val="false"/>
+                <w:u w:val="none"/>
+                <w:strike w:val="false"/>
+                <w:sz w:val="22"/>
+                <w:szCs w:val="22"/>
+                <w:color w:val="000000"/>
+              </w:rPr>
+              <w:t xml:space="preserve">NHS NORTHAMPTONSHIRE INTEGRATED CARE BOARD</w:t>
             </w:r>
           </w:p>
         </w:tc>
@@ -934,7 +822,7 @@
                 <w:szCs w:val="22"/>
                 <w:color w:val="000000"/>
               </w:rPr>
-              <w:t xml:space="preserve">NHS CHESHIRE AND MERSEYSIDE INTEGRATED CARE BOARD</w:t>
+              <w:t xml:space="preserve">NHS BIRMINGHAM AND SOLIHULL INTEGRATED CARE BOARD</w:t>
             </w:r>
           </w:p>
         </w:tc>
@@ -989,7 +877,7 @@
                 <w:szCs w:val="22"/>
                 <w:color w:val="000000"/>
               </w:rPr>
-              <w:t xml:space="preserve">Unidentified doctors</w:t>
+              <w:t xml:space="preserve">NHS NORTHAMPTONSHIRE INTEGRATED CARE BOARD, NHS KENT AND MEDWAY INTEGRATED CARE BOARD, NHS SURREY HEARTLANDS INTEGRATED CARE BOARD, NHS NORFOLK AND WAVENEY INTEGRATED CARE BOARD, NHS LINCOLNSHIRE INTEGRATED CARE BOARD</w:t>
             </w:r>
           </w:p>
         </w:tc>
@@ -1044,7 +932,7 @@
                 <w:szCs w:val="22"/>
                 <w:color w:val="000000"/>
               </w:rPr>
-              <w:t xml:space="preserve">NHS CHESHIRE AND MERSEYSIDE INTEGRATED CARE BOARD, NHS GREATER MANCHESTER INTEGRATED CARE BOARD, NHS NORTH EAST AND NORTH CUMBRIA INTEGRATED CARE BOARD, NHS KENT AND MEDWAY INTEGRATED CARE BOARD, NHS BUCKINGHAMSHIRE, OXFORDSHIRE AND BERKSHIRE WEST INTEGRATED CARE BOARD</w:t>
+              <w:t xml:space="preserve">NHS BIRMINGHAM AND SOLIHULL INTEGRATED CARE BOARD, NHS STAFFORDSHIRE AND STOKE-ON-TRENT INTEGRATED CARE BOARD, NHS HUMBER AND NORTH YORKSHIRE INTEGRATED CARE BOARD, NHS WEST YORKSHIRE INTEGRATED CARE BOARD, NHS NORTH EAST LONDON INTEGRATED CARE BOARD</w:t>
             </w:r>
           </w:p>
         </w:tc>
@@ -1068,38 +956,38 @@
           <w:p>
             <w:pPr>
               <w:pStyle w:val="Normal"/>
-              <w:jc w:val="left"/>
-              <w:pBdr>
-                <w:bottom w:val="none" w:sz="0" w:space="0" w:color="000000"/>
-                <w:top w:val="none" w:sz="0" w:space="0" w:color="000000"/>
-                <w:left w:val="none" w:sz="0" w:space="0" w:color="000000"/>
-                <w:right w:val="none" w:sz="0" w:space="0" w:color="000000"/>
-              </w:pBdr>
-              <w:spacing w:after="100" w:before="100" w:line="240"/>
-              <w:ind w:left="100" w:right="100" w:firstLine="0" w:firstLineChars="0"/>
-              <w:rPr>
-                <w:rFonts w:ascii="Arial" w:hAnsi="Arial" w:eastAsia="Arial" w:cs="Arial"/>
-                <w:i w:val="false"/>
-                <w:b w:val="false"/>
-                <w:u w:val="none"/>
-                <w:strike w:val="false"/>
-                <w:sz w:val="22"/>
-                <w:szCs w:val="22"/>
-                <w:color w:val="000000"/>
-              </w:rPr>
-            </w:pPr>
-            <w:r>
-              <w:rPr>
-                <w:rFonts w:ascii="Arial" w:hAnsi="Arial" w:eastAsia="Arial" w:cs="Arial"/>
-                <w:i w:val="false"/>
-                <w:b w:val="false"/>
-                <w:u w:val="none"/>
-                <w:strike w:val="false"/>
-                <w:sz w:val="22"/>
-                <w:szCs w:val="22"/>
-                <w:color w:val="000000"/>
-              </w:rPr>
-              <w:t xml:space="preserve">Unidentified doctors, NHS SHROPSHIRE, TELFORD AND WREKIN INTEGRATED CARE BOARD, NHS BIRMINGHAM AND SOLIHULL INTEGRATED CARE BOARD, NHS CORNWALL AND THE ISLES OF SCILLY INTEGRATED CARE BOARD, NHS SOMERSET INTEGRATED CARE BOARD</w:t>
+              <w:jc w:val="right"/>
+              <w:pBdr>
+                <w:bottom w:val="none" w:sz="0" w:space="0" w:color="000000"/>
+                <w:top w:val="none" w:sz="0" w:space="0" w:color="000000"/>
+                <w:left w:val="none" w:sz="0" w:space="0" w:color="000000"/>
+                <w:right w:val="none" w:sz="0" w:space="0" w:color="000000"/>
+              </w:pBdr>
+              <w:spacing w:after="100" w:before="100" w:line="240"/>
+              <w:ind w:left="100" w:right="100" w:firstLine="0" w:firstLineChars="0"/>
+              <w:rPr>
+                <w:rFonts w:ascii="Arial" w:hAnsi="Arial" w:eastAsia="Arial" w:cs="Arial"/>
+                <w:i w:val="false"/>
+                <w:b w:val="false"/>
+                <w:u w:val="none"/>
+                <w:strike w:val="false"/>
+                <w:sz w:val="22"/>
+                <w:szCs w:val="22"/>
+                <w:color w:val="000000"/>
+              </w:rPr>
+            </w:pPr>
+            <w:r>
+              <w:rPr>
+                <w:rFonts w:ascii="Arial" w:hAnsi="Arial" w:eastAsia="Arial" w:cs="Arial"/>
+                <w:i w:val="false"/>
+                <w:b w:val="false"/>
+                <w:u w:val="none"/>
+                <w:strike w:val="false"/>
+                <w:sz w:val="22"/>
+                <w:szCs w:val="22"/>
+                <w:color w:val="000000"/>
+              </w:rPr>
+              <w:t xml:space="preserve">228.49</w:t>
             </w:r>
           </w:p>
         </w:tc>
@@ -1154,7 +1042,7 @@
                 <w:szCs w:val="22"/>
                 <w:color w:val="000000"/>
               </w:rPr>
-              <w:t xml:space="preserve">43</w:t>
+              <w:t xml:space="preserve">290.47</w:t>
             </w:r>
           </w:p>
         </w:tc>
@@ -1209,7 +1097,7 @@
                 <w:szCs w:val="22"/>
                 <w:color w:val="000000"/>
               </w:rPr>
-              <w:t xml:space="preserve">258,635.50</w:t>
+              <w:t xml:space="preserve">315.65</w:t>
             </w:r>
           </w:p>
         </w:tc>
@@ -1264,117 +1152,7 @@
                 <w:szCs w:val="22"/>
                 <w:color w:val="000000"/>
               </w:rPr>
-              <w:t xml:space="preserve">365,385.0</w:t>
-            </w:r>
-          </w:p>
-        </w:tc>
-        <w:tc>
-          <w:tcPr>
-            <w:tcBorders>
-              <w:bottom w:val="none" w:sz="0" w:space="0" w:color="000000"/>
-              <w:top w:val="single" w:sz="12" w:space="0" w:color="666666"/>
-              <w:left w:val="none" w:sz="0" w:space="0" w:color="000000"/>
-              <w:right w:val="none" w:sz="0" w:space="0" w:color="000000"/>
-            </w:tcBorders>
-            <w:shd w:val="clear" w:color="auto" w:fill="FFFFFF"/>
-            <w:tcMar>
-              <w:top w:w="0" w:type="dxa"/>
-              <w:bottom w:w="0" w:type="dxa"/>
-              <w:left w:w="0" w:type="dxa"/>
-              <w:right w:w="0" w:type="dxa"/>
-            </w:tcMar>
-            <w:vAlign w:val="center"/>
-          </w:tcPr>
-          <w:p>
-            <w:pPr>
-              <w:pStyle w:val="Normal"/>
-              <w:jc w:val="right"/>
-              <w:pBdr>
-                <w:bottom w:val="none" w:sz="0" w:space="0" w:color="000000"/>
-                <w:top w:val="none" w:sz="0" w:space="0" w:color="000000"/>
-                <w:left w:val="none" w:sz="0" w:space="0" w:color="000000"/>
-                <w:right w:val="none" w:sz="0" w:space="0" w:color="000000"/>
-              </w:pBdr>
-              <w:spacing w:after="100" w:before="100" w:line="240"/>
-              <w:ind w:left="100" w:right="100" w:firstLine="0" w:firstLineChars="0"/>
-              <w:rPr>
-                <w:rFonts w:ascii="Arial" w:hAnsi="Arial" w:eastAsia="Arial" w:cs="Arial"/>
-                <w:i w:val="false"/>
-                <w:b w:val="false"/>
-                <w:u w:val="none"/>
-                <w:strike w:val="false"/>
-                <w:sz w:val="22"/>
-                <w:szCs w:val="22"/>
-                <w:color w:val="000000"/>
-              </w:rPr>
-            </w:pPr>
-            <w:r>
-              <w:rPr>
-                <w:rFonts w:ascii="Arial" w:hAnsi="Arial" w:eastAsia="Arial" w:cs="Arial"/>
-                <w:i w:val="false"/>
-                <w:b w:val="false"/>
-                <w:u w:val="none"/>
-                <w:strike w:val="false"/>
-                <w:sz w:val="22"/>
-                <w:szCs w:val="22"/>
-                <w:color w:val="000000"/>
-              </w:rPr>
-              <w:t xml:space="preserve">466,368.5</w:t>
-            </w:r>
-          </w:p>
-        </w:tc>
-        <w:tc>
-          <w:tcPr>
-            <w:tcBorders>
-              <w:bottom w:val="none" w:sz="0" w:space="0" w:color="000000"/>
-              <w:top w:val="single" w:sz="12" w:space="0" w:color="666666"/>
-              <w:left w:val="none" w:sz="0" w:space="0" w:color="000000"/>
-              <w:right w:val="none" w:sz="0" w:space="0" w:color="000000"/>
-            </w:tcBorders>
-            <w:shd w:val="clear" w:color="auto" w:fill="FFFFFF"/>
-            <w:tcMar>
-              <w:top w:w="0" w:type="dxa"/>
-              <w:bottom w:w="0" w:type="dxa"/>
-              <w:left w:w="0" w:type="dxa"/>
-              <w:right w:w="0" w:type="dxa"/>
-            </w:tcMar>
-            <w:vAlign w:val="center"/>
-          </w:tcPr>
-          <w:p>
-            <w:pPr>
-              <w:pStyle w:val="Normal"/>
-              <w:jc w:val="right"/>
-              <w:pBdr>
-                <w:bottom w:val="none" w:sz="0" w:space="0" w:color="000000"/>
-                <w:top w:val="none" w:sz="0" w:space="0" w:color="000000"/>
-                <w:left w:val="none" w:sz="0" w:space="0" w:color="000000"/>
-                <w:right w:val="none" w:sz="0" w:space="0" w:color="000000"/>
-              </w:pBdr>
-              <w:spacing w:after="100" w:before="100" w:line="240"/>
-              <w:ind w:left="100" w:right="100" w:firstLine="0" w:firstLineChars="0"/>
-              <w:rPr>
-                <w:rFonts w:ascii="Arial" w:hAnsi="Arial" w:eastAsia="Arial" w:cs="Arial"/>
-                <w:i w:val="false"/>
-                <w:b w:val="false"/>
-                <w:u w:val="none"/>
-                <w:strike w:val="false"/>
-                <w:sz w:val="22"/>
-                <w:szCs w:val="22"/>
-                <w:color w:val="000000"/>
-              </w:rPr>
-            </w:pPr>
-            <w:r>
-              <w:rPr>
-                <w:rFonts w:ascii="Arial" w:hAnsi="Arial" w:eastAsia="Arial" w:cs="Arial"/>
-                <w:i w:val="false"/>
-                <w:b w:val="false"/>
-                <w:u w:val="none"/>
-                <w:strike w:val="false"/>
-                <w:sz w:val="22"/>
-                <w:szCs w:val="22"/>
-                <w:color w:val="000000"/>
-              </w:rPr>
-              <w:t xml:space="preserve">207,733.0</w:t>
+              <w:t xml:space="preserve">87.16</w:t>
             </w:r>
           </w:p>
         </w:tc>
@@ -1513,38 +1291,38 @@
           <w:p>
             <w:pPr>
               <w:pStyle w:val="Normal"/>
-              <w:jc w:val="right"/>
-              <w:pBdr>
-                <w:bottom w:val="none" w:sz="0" w:space="0" w:color="000000"/>
-                <w:top w:val="none" w:sz="0" w:space="0" w:color="000000"/>
-                <w:left w:val="none" w:sz="0" w:space="0" w:color="000000"/>
-                <w:right w:val="none" w:sz="0" w:space="0" w:color="000000"/>
-              </w:pBdr>
-              <w:spacing w:after="100" w:before="100" w:line="240"/>
-              <w:ind w:left="100" w:right="100" w:firstLine="0" w:firstLineChars="0"/>
-              <w:rPr>
-                <w:rFonts w:ascii="Arial" w:hAnsi="Arial" w:eastAsia="Arial" w:cs="Arial"/>
-                <w:i w:val="false"/>
-                <w:b w:val="false"/>
-                <w:u w:val="none"/>
-                <w:strike w:val="false"/>
-                <w:sz w:val="22"/>
-                <w:szCs w:val="22"/>
-                <w:color w:val="000000"/>
-              </w:rPr>
-            </w:pPr>
-            <w:r>
-              <w:rPr>
-                <w:rFonts w:ascii="Arial" w:hAnsi="Arial" w:eastAsia="Arial" w:cs="Arial"/>
-                <w:i w:val="false"/>
-                <w:b w:val="false"/>
-                <w:u w:val="none"/>
-                <w:strike w:val="false"/>
-                <w:sz w:val="22"/>
-                <w:szCs w:val="22"/>
-                <w:color w:val="000000"/>
-              </w:rPr>
-              <w:t xml:space="preserve">1,660,189</w:t>
+              <w:jc w:val="left"/>
+              <w:pBdr>
+                <w:bottom w:val="none" w:sz="0" w:space="0" w:color="000000"/>
+                <w:top w:val="none" w:sz="0" w:space="0" w:color="000000"/>
+                <w:left w:val="none" w:sz="0" w:space="0" w:color="000000"/>
+                <w:right w:val="none" w:sz="0" w:space="0" w:color="000000"/>
+              </w:pBdr>
+              <w:spacing w:after="100" w:before="100" w:line="240"/>
+              <w:ind w:left="100" w:right="100" w:firstLine="0" w:firstLineChars="0"/>
+              <w:rPr>
+                <w:rFonts w:ascii="Arial" w:hAnsi="Arial" w:eastAsia="Arial" w:cs="Arial"/>
+                <w:i w:val="false"/>
+                <w:b w:val="false"/>
+                <w:u w:val="none"/>
+                <w:strike w:val="false"/>
+                <w:sz w:val="22"/>
+                <w:szCs w:val="22"/>
+                <w:color w:val="000000"/>
+              </w:rPr>
+            </w:pPr>
+            <w:r>
+              <w:rPr>
+                <w:rFonts w:ascii="Arial" w:hAnsi="Arial" w:eastAsia="Arial" w:cs="Arial"/>
+                <w:i w:val="false"/>
+                <w:b w:val="false"/>
+                <w:u w:val="none"/>
+                <w:strike w:val="false"/>
+                <w:sz w:val="22"/>
+                <w:szCs w:val="22"/>
+                <w:color w:val="000000"/>
+              </w:rPr>
+              <w:t xml:space="preserve">NHS CORNWALL AND THE ISLES OF SCILLY INTEGRATED CARE BOARD</w:t>
             </w:r>
           </w:p>
         </w:tc>
@@ -1599,7 +1377,7 @@
                 <w:szCs w:val="22"/>
                 <w:color w:val="000000"/>
               </w:rPr>
-              <w:t xml:space="preserve">NHS CORNWALL AND THE ISLES OF SCILLY INTEGRATED CARE BOARD</w:t>
+              <w:t xml:space="preserve">NHS BLACK COUNTRY INTEGRATED CARE BOARD</w:t>
             </w:r>
           </w:p>
         </w:tc>
@@ -1654,7 +1432,7 @@
                 <w:szCs w:val="22"/>
                 <w:color w:val="000000"/>
               </w:rPr>
-              <w:t xml:space="preserve">NHS SOMERSET INTEGRATED CARE BOARD</w:t>
+              <w:t xml:space="preserve">NHS CORNWALL AND THE ISLES OF SCILLY INTEGRATED CARE BOARD, NHS LINCOLNSHIRE INTEGRATED CARE BOARD, NHS NORTH WEST LONDON INTEGRATED CARE BOARD, NHS BATH AND NORTH EAST SOMERSET, SWINDON AND WILTSHIRE INTEGRATED CARE BOARD, NHS NORTH CENTRAL LONDON INTEGRATED CARE BOARD</w:t>
             </w:r>
           </w:p>
         </w:tc>
@@ -1709,7 +1487,7 @@
                 <w:szCs w:val="22"/>
                 <w:color w:val="000000"/>
               </w:rPr>
-              <w:t xml:space="preserve">NHS CORNWALL AND THE ISLES OF SCILLY INTEGRATED CARE BOARD, NHS LINCOLNSHIRE INTEGRATED CARE BOARD, NHS NORTH WEST LONDON INTEGRATED CARE BOARD, NHS NORTH CENTRAL LONDON INTEGRATED CARE BOARD, NHS BATH AND NORTH EAST SOMERSET, SWINDON AND WILTSHIRE INTEGRATED CARE BOARD</w:t>
+              <w:t xml:space="preserve">NHS BLACK COUNTRY INTEGRATED CARE BOARD, NHS STAFFORDSHIRE AND STOKE-ON-TRENT INTEGRATED CARE BOARD, NHS HUMBER AND NORTH YORKSHIRE INTEGRATED CARE BOARD, NHS SOMERSET INTEGRATED CARE BOARD, NHS DERBY AND DERBYSHIRE INTEGRATED CARE BOARD</w:t>
             </w:r>
           </w:p>
         </w:tc>
@@ -1733,38 +1511,38 @@
           <w:p>
             <w:pPr>
               <w:pStyle w:val="Normal"/>
-              <w:jc w:val="left"/>
-              <w:pBdr>
-                <w:bottom w:val="none" w:sz="0" w:space="0" w:color="000000"/>
-                <w:top w:val="none" w:sz="0" w:space="0" w:color="000000"/>
-                <w:left w:val="none" w:sz="0" w:space="0" w:color="000000"/>
-                <w:right w:val="none" w:sz="0" w:space="0" w:color="000000"/>
-              </w:pBdr>
-              <w:spacing w:after="100" w:before="100" w:line="240"/>
-              <w:ind w:left="100" w:right="100" w:firstLine="0" w:firstLineChars="0"/>
-              <w:rPr>
-                <w:rFonts w:ascii="Arial" w:hAnsi="Arial" w:eastAsia="Arial" w:cs="Arial"/>
-                <w:i w:val="false"/>
-                <w:b w:val="false"/>
-                <w:u w:val="none"/>
-                <w:strike w:val="false"/>
-                <w:sz w:val="22"/>
-                <w:szCs w:val="22"/>
-                <w:color w:val="000000"/>
-              </w:rPr>
-            </w:pPr>
-            <w:r>
-              <w:rPr>
-                <w:rFonts w:ascii="Arial" w:hAnsi="Arial" w:eastAsia="Arial" w:cs="Arial"/>
-                <w:i w:val="false"/>
-                <w:b w:val="false"/>
-                <w:u w:val="none"/>
-                <w:strike w:val="false"/>
-                <w:sz w:val="22"/>
-                <w:szCs w:val="22"/>
-                <w:color w:val="000000"/>
-              </w:rPr>
-              <w:t xml:space="preserve">NHS SOMERSET INTEGRATED CARE BOARD, NHS BLACK COUNTRY INTEGRATED CARE BOARD, NHS STAFFORDSHIRE AND STOKE-ON-TRENT INTEGRATED CARE BOARD, NHS NORTHAMPTONSHIRE INTEGRATED CARE BOARD, NHS HUMBER AND NORTH YORKSHIRE INTEGRATED CARE BOARD</w:t>
+              <w:jc w:val="right"/>
+              <w:pBdr>
+                <w:bottom w:val="none" w:sz="0" w:space="0" w:color="000000"/>
+                <w:top w:val="none" w:sz="0" w:space="0" w:color="000000"/>
+                <w:left w:val="none" w:sz="0" w:space="0" w:color="000000"/>
+                <w:right w:val="none" w:sz="0" w:space="0" w:color="000000"/>
+              </w:pBdr>
+              <w:spacing w:after="100" w:before="100" w:line="240"/>
+              <w:ind w:left="100" w:right="100" w:firstLine="0" w:firstLineChars="0"/>
+              <w:rPr>
+                <w:rFonts w:ascii="Arial" w:hAnsi="Arial" w:eastAsia="Arial" w:cs="Arial"/>
+                <w:i w:val="false"/>
+                <w:b w:val="false"/>
+                <w:u w:val="none"/>
+                <w:strike w:val="false"/>
+                <w:sz w:val="22"/>
+                <w:szCs w:val="22"/>
+                <w:color w:val="000000"/>
+              </w:rPr>
+            </w:pPr>
+            <w:r>
+              <w:rPr>
+                <w:rFonts w:ascii="Arial" w:hAnsi="Arial" w:eastAsia="Arial" w:cs="Arial"/>
+                <w:i w:val="false"/>
+                <w:b w:val="false"/>
+                <w:u w:val="none"/>
+                <w:strike w:val="false"/>
+                <w:sz w:val="22"/>
+                <w:szCs w:val="22"/>
+                <w:color w:val="000000"/>
+              </w:rPr>
+              <w:t xml:space="preserve">3.48</w:t>
             </w:r>
           </w:p>
         </w:tc>
@@ -1819,7 +1597,7 @@
                 <w:szCs w:val="22"/>
                 <w:color w:val="000000"/>
               </w:rPr>
-              <w:t xml:space="preserve">18</w:t>
+              <w:t xml:space="preserve">8.21</w:t>
             </w:r>
           </w:p>
         </w:tc>
@@ -1874,7 +1652,7 @@
                 <w:szCs w:val="22"/>
                 <w:color w:val="000000"/>
               </w:rPr>
-              <w:t xml:space="preserve">3,885.00</w:t>
+              <w:t xml:space="preserve">13.53</w:t>
             </w:r>
           </w:p>
         </w:tc>
@@ -1929,117 +1707,7 @@
                 <w:szCs w:val="22"/>
                 <w:color w:val="000000"/>
               </w:rPr>
-              <w:t xml:space="preserve">11,460.0</w:t>
-            </w:r>
-          </w:p>
-        </w:tc>
-        <w:tc>
-          <w:tcPr>
-            <w:tcBorders>
-              <w:bottom w:val="none" w:sz="0" w:space="0" w:color="000000"/>
-              <w:top w:val="none" w:sz="0" w:space="0" w:color="000000"/>
-              <w:left w:val="none" w:sz="0" w:space="0" w:color="000000"/>
-              <w:right w:val="none" w:sz="0" w:space="0" w:color="000000"/>
-            </w:tcBorders>
-            <w:shd w:val="clear" w:color="auto" w:fill="FFFFFF"/>
-            <w:tcMar>
-              <w:top w:w="0" w:type="dxa"/>
-              <w:bottom w:w="0" w:type="dxa"/>
-              <w:left w:w="0" w:type="dxa"/>
-              <w:right w:w="0" w:type="dxa"/>
-            </w:tcMar>
-            <w:vAlign w:val="center"/>
-          </w:tcPr>
-          <w:p>
-            <w:pPr>
-              <w:pStyle w:val="Normal"/>
-              <w:jc w:val="right"/>
-              <w:pBdr>
-                <w:bottom w:val="none" w:sz="0" w:space="0" w:color="000000"/>
-                <w:top w:val="none" w:sz="0" w:space="0" w:color="000000"/>
-                <w:left w:val="none" w:sz="0" w:space="0" w:color="000000"/>
-                <w:right w:val="none" w:sz="0" w:space="0" w:color="000000"/>
-              </w:pBdr>
-              <w:spacing w:after="100" w:before="100" w:line="240"/>
-              <w:ind w:left="100" w:right="100" w:firstLine="0" w:firstLineChars="0"/>
-              <w:rPr>
-                <w:rFonts w:ascii="Arial" w:hAnsi="Arial" w:eastAsia="Arial" w:cs="Arial"/>
-                <w:i w:val="false"/>
-                <w:b w:val="false"/>
-                <w:u w:val="none"/>
-                <w:strike w:val="false"/>
-                <w:sz w:val="22"/>
-                <w:szCs w:val="22"/>
-                <w:color w:val="000000"/>
-              </w:rPr>
-            </w:pPr>
-            <w:r>
-              <w:rPr>
-                <w:rFonts w:ascii="Arial" w:hAnsi="Arial" w:eastAsia="Arial" w:cs="Arial"/>
-                <w:i w:val="false"/>
-                <w:b w:val="false"/>
-                <w:u w:val="none"/>
-                <w:strike w:val="false"/>
-                <w:sz w:val="22"/>
-                <w:szCs w:val="22"/>
-                <w:color w:val="000000"/>
-              </w:rPr>
-              <w:t xml:space="preserve">27,051.0</w:t>
-            </w:r>
-          </w:p>
-        </w:tc>
-        <w:tc>
-          <w:tcPr>
-            <w:tcBorders>
-              <w:bottom w:val="none" w:sz="0" w:space="0" w:color="000000"/>
-              <w:top w:val="none" w:sz="0" w:space="0" w:color="000000"/>
-              <w:left w:val="none" w:sz="0" w:space="0" w:color="000000"/>
-              <w:right w:val="none" w:sz="0" w:space="0" w:color="000000"/>
-            </w:tcBorders>
-            <w:shd w:val="clear" w:color="auto" w:fill="FFFFFF"/>
-            <w:tcMar>
-              <w:top w:w="0" w:type="dxa"/>
-              <w:bottom w:w="0" w:type="dxa"/>
-              <w:left w:w="0" w:type="dxa"/>
-              <w:right w:w="0" w:type="dxa"/>
-            </w:tcMar>
-            <w:vAlign w:val="center"/>
-          </w:tcPr>
-          <w:p>
-            <w:pPr>
-              <w:pStyle w:val="Normal"/>
-              <w:jc w:val="right"/>
-              <w:pBdr>
-                <w:bottom w:val="none" w:sz="0" w:space="0" w:color="000000"/>
-                <w:top w:val="none" w:sz="0" w:space="0" w:color="000000"/>
-                <w:left w:val="none" w:sz="0" w:space="0" w:color="000000"/>
-                <w:right w:val="none" w:sz="0" w:space="0" w:color="000000"/>
-              </w:pBdr>
-              <w:spacing w:after="100" w:before="100" w:line="240"/>
-              <w:ind w:left="100" w:right="100" w:firstLine="0" w:firstLineChars="0"/>
-              <w:rPr>
-                <w:rFonts w:ascii="Arial" w:hAnsi="Arial" w:eastAsia="Arial" w:cs="Arial"/>
-                <w:i w:val="false"/>
-                <w:b w:val="false"/>
-                <w:u w:val="none"/>
-                <w:strike w:val="false"/>
-                <w:sz w:val="22"/>
-                <w:szCs w:val="22"/>
-                <w:color w:val="000000"/>
-              </w:rPr>
-            </w:pPr>
-            <w:r>
-              <w:rPr>
-                <w:rFonts w:ascii="Arial" w:hAnsi="Arial" w:eastAsia="Arial" w:cs="Arial"/>
-                <w:i w:val="false"/>
-                <w:b w:val="false"/>
-                <w:u w:val="none"/>
-                <w:strike w:val="false"/>
-                <w:sz w:val="22"/>
-                <w:szCs w:val="22"/>
-                <w:color w:val="000000"/>
-              </w:rPr>
-              <w:t xml:space="preserve">23,166.0</w:t>
+              <w:t xml:space="preserve">10.05</w:t>
             </w:r>
           </w:p>
         </w:tc>
@@ -2178,38 +1846,38 @@
           <w:p>
             <w:pPr>
               <w:pStyle w:val="Normal"/>
-              <w:jc w:val="right"/>
-              <w:pBdr>
-                <w:bottom w:val="none" w:sz="0" w:space="0" w:color="000000"/>
-                <w:top w:val="none" w:sz="0" w:space="0" w:color="000000"/>
-                <w:left w:val="none" w:sz="0" w:space="0" w:color="000000"/>
-                <w:right w:val="none" w:sz="0" w:space="0" w:color="000000"/>
-              </w:pBdr>
-              <w:spacing w:after="100" w:before="100" w:line="240"/>
-              <w:ind w:left="100" w:right="100" w:firstLine="0" w:firstLineChars="0"/>
-              <w:rPr>
-                <w:rFonts w:ascii="Arial" w:hAnsi="Arial" w:eastAsia="Arial" w:cs="Arial"/>
-                <w:i w:val="false"/>
-                <w:b w:val="false"/>
-                <w:u w:val="none"/>
-                <w:strike w:val="false"/>
-                <w:sz w:val="22"/>
-                <w:szCs w:val="22"/>
-                <w:color w:val="000000"/>
-              </w:rPr>
-            </w:pPr>
-            <w:r>
-              <w:rPr>
-                <w:rFonts w:ascii="Arial" w:hAnsi="Arial" w:eastAsia="Arial" w:cs="Arial"/>
-                <w:i w:val="false"/>
-                <w:b w:val="false"/>
-                <w:u w:val="none"/>
-                <w:strike w:val="false"/>
-                <w:sz w:val="22"/>
-                <w:szCs w:val="22"/>
-                <w:color w:val="000000"/>
-              </w:rPr>
-              <w:t xml:space="preserve">10,563,731</w:t>
+              <w:jc w:val="left"/>
+              <w:pBdr>
+                <w:bottom w:val="none" w:sz="0" w:space="0" w:color="000000"/>
+                <w:top w:val="none" w:sz="0" w:space="0" w:color="000000"/>
+                <w:left w:val="none" w:sz="0" w:space="0" w:color="000000"/>
+                <w:right w:val="none" w:sz="0" w:space="0" w:color="000000"/>
+              </w:pBdr>
+              <w:spacing w:after="100" w:before="100" w:line="240"/>
+              <w:ind w:left="100" w:right="100" w:firstLine="0" w:firstLineChars="0"/>
+              <w:rPr>
+                <w:rFonts w:ascii="Arial" w:hAnsi="Arial" w:eastAsia="Arial" w:cs="Arial"/>
+                <w:i w:val="false"/>
+                <w:b w:val="false"/>
+                <w:u w:val="none"/>
+                <w:strike w:val="false"/>
+                <w:sz w:val="22"/>
+                <w:szCs w:val="22"/>
+                <w:color w:val="000000"/>
+              </w:rPr>
+            </w:pPr>
+            <w:r>
+              <w:rPr>
+                <w:rFonts w:ascii="Arial" w:hAnsi="Arial" w:eastAsia="Arial" w:cs="Arial"/>
+                <w:i w:val="false"/>
+                <w:b w:val="false"/>
+                <w:u w:val="none"/>
+                <w:strike w:val="false"/>
+                <w:sz w:val="22"/>
+                <w:szCs w:val="22"/>
+                <w:color w:val="000000"/>
+              </w:rPr>
+              <w:t xml:space="preserve">NHS BATH AND NORTH EAST SOMERSET, SWINDON AND WILTSHIRE INTEGRATED CARE BOARD</w:t>
             </w:r>
           </w:p>
         </w:tc>
@@ -2264,7 +1932,7 @@
                 <w:szCs w:val="22"/>
                 <w:color w:val="000000"/>
               </w:rPr>
-              <w:t xml:space="preserve">NHS Greater Manchester</w:t>
+              <w:t xml:space="preserve">NHS BEDFORDSHIRE, LUTON AND MILTON KEYNES INTEGRATED CARE BOARD</w:t>
             </w:r>
           </w:p>
         </w:tc>
@@ -2319,7 +1987,7 @@
                 <w:szCs w:val="22"/>
                 <w:color w:val="000000"/>
               </w:rPr>
-              <w:t xml:space="preserve">NHS Bedfordshire, Luton And Milton Keynes</w:t>
+              <w:t xml:space="preserve">NHS BATH AND NORTH EAST SOMERSET, SWINDON AND WILTSHIRE INTEGRATED CARE BOARD, NHS LINCOLNSHIRE INTEGRATED CARE BOARD, NHS BIRMINGHAM AND SOLIHULL INTEGRATED CARE BOARD, NHS LANCASHIRE AND SOUTH CUMBRIA INTEGRATED CARE BOARD, NHS HERTFORDSHIRE AND WEST ESSEX INTEGRATED CARE BOARD</w:t>
             </w:r>
           </w:p>
         </w:tc>
@@ -2374,7 +2042,7 @@
                 <w:szCs w:val="22"/>
                 <w:color w:val="000000"/>
               </w:rPr>
-              <w:t xml:space="preserve">NHS Greater Manchester, NHS Bath And North East Somerset, Swindon And Wiltshire, NHS Cheshire And Merseyside, NHS Lancashire And South Cumbria, NHS Lincolnshire</w:t>
+              <w:t xml:space="preserve">NHS BEDFORDSHIRE, LUTON AND MILTON KEYNES INTEGRATED CARE BOARD, NHS CORNWALL AND THE ISLES OF SCILLY INTEGRATED CARE BOARD, NHS FRIMLEY INTEGRATED CARE BOARD, NHS STAFFORDSHIRE AND STOKE-ON-TRENT INTEGRATED CARE BOARD, NHS SURREY HEARTLANDS INTEGRATED CARE BOARD</w:t>
             </w:r>
           </w:p>
         </w:tc>
@@ -2398,38 +2066,38 @@
           <w:p>
             <w:pPr>
               <w:pStyle w:val="Normal"/>
-              <w:jc w:val="left"/>
-              <w:pBdr>
-                <w:bottom w:val="none" w:sz="0" w:space="0" w:color="000000"/>
-                <w:top w:val="none" w:sz="0" w:space="0" w:color="000000"/>
-                <w:left w:val="none" w:sz="0" w:space="0" w:color="000000"/>
-                <w:right w:val="none" w:sz="0" w:space="0" w:color="000000"/>
-              </w:pBdr>
-              <w:spacing w:after="100" w:before="100" w:line="240"/>
-              <w:ind w:left="100" w:right="100" w:firstLine="0" w:firstLineChars="0"/>
-              <w:rPr>
-                <w:rFonts w:ascii="Arial" w:hAnsi="Arial" w:eastAsia="Arial" w:cs="Arial"/>
-                <w:i w:val="false"/>
-                <w:b w:val="false"/>
-                <w:u w:val="none"/>
-                <w:strike w:val="false"/>
-                <w:sz w:val="22"/>
-                <w:szCs w:val="22"/>
-                <w:color w:val="000000"/>
-              </w:rPr>
-            </w:pPr>
-            <w:r>
-              <w:rPr>
-                <w:rFonts w:ascii="Arial" w:hAnsi="Arial" w:eastAsia="Arial" w:cs="Arial"/>
-                <w:i w:val="false"/>
-                <w:b w:val="false"/>
-                <w:u w:val="none"/>
-                <w:strike w:val="false"/>
-                <w:sz w:val="22"/>
-                <w:szCs w:val="22"/>
-                <w:color w:val="000000"/>
-              </w:rPr>
-              <w:t xml:space="preserve">NHS Bedfordshire, Luton And Milton Keynes, NHS Cornwall And The Isles Of Scilly, NHS Frimley, NHS Staffordshire And Stoke-On-Trent, NHS Surrey Heartlands</w:t>
+              <w:jc w:val="right"/>
+              <w:pBdr>
+                <w:bottom w:val="none" w:sz="0" w:space="0" w:color="000000"/>
+                <w:top w:val="none" w:sz="0" w:space="0" w:color="000000"/>
+                <w:left w:val="none" w:sz="0" w:space="0" w:color="000000"/>
+                <w:right w:val="none" w:sz="0" w:space="0" w:color="000000"/>
+              </w:pBdr>
+              <w:spacing w:after="100" w:before="100" w:line="240"/>
+              <w:ind w:left="100" w:right="100" w:firstLine="0" w:firstLineChars="0"/>
+              <w:rPr>
+                <w:rFonts w:ascii="Arial" w:hAnsi="Arial" w:eastAsia="Arial" w:cs="Arial"/>
+                <w:i w:val="false"/>
+                <w:b w:val="false"/>
+                <w:u w:val="none"/>
+                <w:strike w:val="false"/>
+                <w:sz w:val="22"/>
+                <w:szCs w:val="22"/>
+                <w:color w:val="000000"/>
+              </w:rPr>
+            </w:pPr>
+            <w:r>
+              <w:rPr>
+                <w:rFonts w:ascii="Arial" w:hAnsi="Arial" w:eastAsia="Arial" w:cs="Arial"/>
+                <w:i w:val="false"/>
+                <w:b w:val="false"/>
+                <w:u w:val="none"/>
+                <w:strike w:val="false"/>
+                <w:sz w:val="22"/>
+                <w:szCs w:val="22"/>
+                <w:color w:val="000000"/>
+              </w:rPr>
+              <w:t xml:space="preserve">34.35</w:t>
             </w:r>
           </w:p>
         </w:tc>
@@ -2484,7 +2152,7 @@
                 <w:szCs w:val="22"/>
                 <w:color w:val="000000"/>
               </w:rPr>
-              <w:t xml:space="preserve"/>
+              <w:t xml:space="preserve">82.90</w:t>
             </w:r>
           </w:p>
         </w:tc>
@@ -2539,7 +2207,7 @@
                 <w:szCs w:val="22"/>
                 <w:color w:val="000000"/>
               </w:rPr>
-              <w:t xml:space="preserve">41,859.54</w:t>
+              <w:t xml:space="preserve">222.01</w:t>
             </w:r>
           </w:p>
         </w:tc>
@@ -2594,117 +2262,7 @@
                 <w:szCs w:val="22"/>
                 <w:color w:val="000000"/>
               </w:rPr>
-              <w:t xml:space="preserve">107,006.9</w:t>
-            </w:r>
-          </w:p>
-        </w:tc>
-        <w:tc>
-          <w:tcPr>
-            <w:tcBorders>
-              <w:bottom w:val="single" w:sz="12" w:space="0" w:color="666666"/>
-              <w:top w:val="none" w:sz="0" w:space="0" w:color="000000"/>
-              <w:left w:val="none" w:sz="0" w:space="0" w:color="000000"/>
-              <w:right w:val="none" w:sz="0" w:space="0" w:color="000000"/>
-            </w:tcBorders>
-            <w:shd w:val="clear" w:color="auto" w:fill="FFFFFF"/>
-            <w:tcMar>
-              <w:top w:w="0" w:type="dxa"/>
-              <w:bottom w:w="0" w:type="dxa"/>
-              <w:left w:w="0" w:type="dxa"/>
-              <w:right w:w="0" w:type="dxa"/>
-            </w:tcMar>
-            <w:vAlign w:val="center"/>
-          </w:tcPr>
-          <w:p>
-            <w:pPr>
-              <w:pStyle w:val="Normal"/>
-              <w:jc w:val="right"/>
-              <w:pBdr>
-                <w:bottom w:val="none" w:sz="0" w:space="0" w:color="000000"/>
-                <w:top w:val="none" w:sz="0" w:space="0" w:color="000000"/>
-                <w:left w:val="none" w:sz="0" w:space="0" w:color="000000"/>
-                <w:right w:val="none" w:sz="0" w:space="0" w:color="000000"/>
-              </w:pBdr>
-              <w:spacing w:after="100" w:before="100" w:line="240"/>
-              <w:ind w:left="100" w:right="100" w:firstLine="0" w:firstLineChars="0"/>
-              <w:rPr>
-                <w:rFonts w:ascii="Arial" w:hAnsi="Arial" w:eastAsia="Arial" w:cs="Arial"/>
-                <w:i w:val="false"/>
-                <w:b w:val="false"/>
-                <w:u w:val="none"/>
-                <w:strike w:val="false"/>
-                <w:sz w:val="22"/>
-                <w:szCs w:val="22"/>
-                <w:color w:val="000000"/>
-              </w:rPr>
-            </w:pPr>
-            <w:r>
-              <w:rPr>
-                <w:rFonts w:ascii="Arial" w:hAnsi="Arial" w:eastAsia="Arial" w:cs="Arial"/>
-                <w:i w:val="false"/>
-                <w:b w:val="false"/>
-                <w:u w:val="none"/>
-                <w:strike w:val="false"/>
-                <w:sz w:val="22"/>
-                <w:szCs w:val="22"/>
-                <w:color w:val="000000"/>
-              </w:rPr>
-              <w:t xml:space="preserve">349,403.1</w:t>
-            </w:r>
-          </w:p>
-        </w:tc>
-        <w:tc>
-          <w:tcPr>
-            <w:tcBorders>
-              <w:bottom w:val="single" w:sz="12" w:space="0" w:color="666666"/>
-              <w:top w:val="none" w:sz="0" w:space="0" w:color="000000"/>
-              <w:left w:val="none" w:sz="0" w:space="0" w:color="000000"/>
-              <w:right w:val="none" w:sz="0" w:space="0" w:color="000000"/>
-            </w:tcBorders>
-            <w:shd w:val="clear" w:color="auto" w:fill="FFFFFF"/>
-            <w:tcMar>
-              <w:top w:w="0" w:type="dxa"/>
-              <w:bottom w:w="0" w:type="dxa"/>
-              <w:left w:w="0" w:type="dxa"/>
-              <w:right w:w="0" w:type="dxa"/>
-            </w:tcMar>
-            <w:vAlign w:val="center"/>
-          </w:tcPr>
-          <w:p>
-            <w:pPr>
-              <w:pStyle w:val="Normal"/>
-              <w:jc w:val="right"/>
-              <w:pBdr>
-                <w:bottom w:val="none" w:sz="0" w:space="0" w:color="000000"/>
-                <w:top w:val="none" w:sz="0" w:space="0" w:color="000000"/>
-                <w:left w:val="none" w:sz="0" w:space="0" w:color="000000"/>
-                <w:right w:val="none" w:sz="0" w:space="0" w:color="000000"/>
-              </w:pBdr>
-              <w:spacing w:after="100" w:before="100" w:line="240"/>
-              <w:ind w:left="100" w:right="100" w:firstLine="0" w:firstLineChars="0"/>
-              <w:rPr>
-                <w:rFonts w:ascii="Arial" w:hAnsi="Arial" w:eastAsia="Arial" w:cs="Arial"/>
-                <w:i w:val="false"/>
-                <w:b w:val="false"/>
-                <w:u w:val="none"/>
-                <w:strike w:val="false"/>
-                <w:sz w:val="22"/>
-                <w:szCs w:val="22"/>
-                <w:color w:val="000000"/>
-              </w:rPr>
-            </w:pPr>
-            <w:r>
-              <w:rPr>
-                <w:rFonts w:ascii="Arial" w:hAnsi="Arial" w:eastAsia="Arial" w:cs="Arial"/>
-                <w:i w:val="false"/>
-                <w:b w:val="false"/>
-                <w:u w:val="none"/>
-                <w:strike w:val="false"/>
-                <w:sz w:val="22"/>
-                <w:szCs w:val="22"/>
-                <w:color w:val="000000"/>
-              </w:rPr>
-              <w:t xml:space="preserve">307,543.6</w:t>
+              <w:t xml:space="preserve">187.66</w:t>
             </w:r>
           </w:p>
         </w:tc>

</xml_diff>